<commit_message>
text príspeku do kampane Sharp dňa: 2.8.2026
</commit_message>
<xml_diff>
--- a/Moje_Dokumenty/🦊 DEUTSCHE TELEKOM OKRÁDA OBČANOV EÚ.docx
+++ b/Moje_Dokumenty/🦊 DEUTSCHE TELEKOM OKRÁDA OBČANOV EÚ.docx
@@ -477,35 +477,24 @@
           <w:b/>
           <w:bCs/>
         </w:rPr>
-        <w:t>zlodeji</w:t>
-      </w:r>
-      <w:r>
-        <w:rPr>
-          <w:b/>
-          <w:bCs/>
-        </w:rPr>
-        <w:t xml:space="preserve"> a podvodníci</w:t>
-      </w:r>
-      <w:r>
-        <w:t xml:space="preserve">, ktorí spoliehajú na to, že sa </w:t>
-      </w:r>
-      <w:r>
-        <w:t xml:space="preserve">im </w:t>
-      </w:r>
-      <w:r>
-        <w:t>nikto neodváži postaviť</w:t>
-      </w:r>
-      <w:r>
-        <w:t xml:space="preserve"> </w:t>
-      </w:r>
-      <w:r>
-        <w:t>na odpor</w:t>
-      </w:r>
-      <w:r>
-        <w:t>. Ja som sa odvážil. Súdim sa s nimi sám, bez advokáta.</w:t>
-      </w:r>
-      <w:r>
-        <w:t xml:space="preserve"> Ide o </w:t>
+        <w:t>zlodeji a podvodníci</w:t>
+      </w:r>
+      <w:r>
+        <w:t xml:space="preserve">, ktorí </w:t>
+      </w:r>
+      <w:r>
+        <w:t xml:space="preserve">sa </w:t>
+      </w:r>
+      <w:r>
+        <w:t>spoliehajú na to, že sa im</w:t>
+      </w:r>
+      <w:r>
+        <w:br/>
+        <w:t>nikto neodváži postaviť na odpor. Ja som sa odvážil. Súdim sa s nimi sám, bez</w:t>
+      </w:r>
+      <w:r>
+        <w:br/>
+        <w:t xml:space="preserve">advokáta. Ide o </w:t>
       </w:r>
       <w:proofErr w:type="spellStart"/>
       <w:r>
@@ -513,19 +502,35 @@
       </w:r>
       <w:proofErr w:type="spellEnd"/>
       <w:r>
-        <w:t xml:space="preserve"> podvod celoeurópskeho rozsahu rádovo v miliardách EUR s priamym zasahovaním do majetkový</w:t>
-      </w:r>
-      <w:r>
-        <w:t>ch</w:t>
-      </w:r>
-      <w:r>
-        <w:t xml:space="preserve"> p</w:t>
-      </w:r>
-      <w:r>
-        <w:t>r</w:t>
-      </w:r>
-      <w:r>
-        <w:t>áv občanov Európskej únie.</w:t>
+        <w:t xml:space="preserve"> podvod celoeurópskeho rozsahu rádovo v miliardách</w:t>
+      </w:r>
+      <w:r>
+        <w:br/>
+        <w:t>eur s</w:t>
+      </w:r>
+      <w:r>
+        <w:t> </w:t>
+      </w:r>
+      <w:r>
+        <w:t>priamym</w:t>
+      </w:r>
+      <w:r>
+        <w:t xml:space="preserve"> poškodzovaním Finančných záujmov Európskej únie a</w:t>
+      </w:r>
+      <w:r>
+        <w:t xml:space="preserve"> zasahovaním do majetkových práv občanov </w:t>
+      </w:r>
+      <w:r>
+        <w:t xml:space="preserve">Nemecka, Slovenska a </w:t>
+      </w:r>
+      <w:r>
+        <w:t>E</w:t>
+      </w:r>
+      <w:r>
+        <w:t>Ú</w:t>
+      </w:r>
+      <w:r>
+        <w:t>.</w:t>
       </w:r>
     </w:p>
     <w:p>
@@ -594,6 +599,87 @@
       </w:r>
     </w:p>
     <w:p/>
+    <w:p/>
+    <w:p>
+      <w:r>
+        <w:t xml:space="preserve">Volám to pravým menom: </w:t>
+      </w:r>
+      <w:r>
+        <w:rPr>
+          <w:b/>
+          <w:bCs/>
+        </w:rPr>
+        <w:t>zlodeji a podvodníci</w:t>
+      </w:r>
+      <w:r>
+        <w:t xml:space="preserve">, ktorí </w:t>
+      </w:r>
+      <w:r>
+        <w:t xml:space="preserve">sa </w:t>
+      </w:r>
+      <w:r>
+        <w:t>spoliehajú na to, že sa im</w:t>
+      </w:r>
+      <w:r>
+        <w:br/>
+        <w:t>nikto neodváži postaviť na odpor. Ja som sa odvážil. Súdim sa s nimi sám, bez</w:t>
+      </w:r>
+      <w:r>
+        <w:br/>
+        <w:t xml:space="preserve">advokáta. Ide o </w:t>
+      </w:r>
+      <w:proofErr w:type="spellStart"/>
+      <w:r>
+        <w:t>KARTEL</w:t>
+      </w:r>
+      <w:r>
+        <w:t>ový</w:t>
+      </w:r>
+      <w:proofErr w:type="spellEnd"/>
+      <w:r>
+        <w:t xml:space="preserve"> podvod celoeurópskeho rozsahu rádovo v miliardách</w:t>
+      </w:r>
+      <w:r>
+        <w:br/>
+        <w:t>eur s</w:t>
+      </w:r>
+      <w:r>
+        <w:t> </w:t>
+      </w:r>
+      <w:r>
+        <w:t>priamym</w:t>
+      </w:r>
+      <w:r>
+        <w:t xml:space="preserve"> poškodzovaním </w:t>
+      </w:r>
+      <w:r>
+        <w:t>Finančných záujmov Európskej únie a</w:t>
+      </w:r>
+      <w:r>
+        <w:t xml:space="preserve"> zasahovaním do majetkových práv občanov </w:t>
+      </w:r>
+      <w:r>
+        <w:t>Nemecka</w:t>
+      </w:r>
+      <w:r>
+        <w:t>, Slovenska</w:t>
+      </w:r>
+      <w:r>
+        <w:t xml:space="preserve"> a</w:t>
+      </w:r>
+      <w:r>
+        <w:t xml:space="preserve"> </w:t>
+      </w:r>
+      <w:r>
+        <w:t>E</w:t>
+      </w:r>
+      <w:r>
+        <w:t>Ú</w:t>
+      </w:r>
+      <w:r>
+        <w:t>.</w:t>
+      </w:r>
+    </w:p>
     <w:sectPr>
       <w:pgSz w:w="11906" w:h="16838"/>
       <w:pgMar w:top="1417" w:right="1417" w:bottom="1417" w:left="1417" w:header="708" w:footer="708" w:gutter="0"/>
@@ -1004,6 +1090,7 @@
   <w:style w:type="paragraph" w:default="1" w:styleId="Normlny">
     <w:name w:val="Normal"/>
     <w:qFormat/>
+    <w:rsid w:val="00C07F92"/>
   </w:style>
   <w:style w:type="paragraph" w:styleId="Nadpis1">
     <w:name w:val="heading 1"/>
@@ -1207,7 +1294,6 @@
   <w:style w:type="character" w:default="1" w:styleId="Predvolenpsmoodseku">
     <w:name w:val="Default Paragraph Font"/>
     <w:uiPriority w:val="1"/>
-    <w:semiHidden/>
     <w:unhideWhenUsed/>
   </w:style>
   <w:style w:type="table" w:default="1" w:styleId="Normlnatabuka">

</xml_diff>